<commit_message>
Add ALAGA build guide; switch fan driver to a 3.3 V logic-level MOSFET
The build guide lists every part with estimated prices, tools, the sewing
pattern, base and spine construction, wiring, programming, voice prompts,
power-up checks, calibration, and troubleshooting. The IRF520 module does
not switch fully from the ESP32's 3.3 V output, so the paper, deck, and
program now use a D4184 module.

Co-Authored-By: Claude Opus 5.5 <noreply@anthropic.com>
Claude-Session: https://claude.ai/code/session_01MfReZH7HCVc5jwegZ7NE6b
</commit_message>
<xml_diff>
--- a/research/RIM3_ALAGA/RIM3_ALAGA_NSTF_Research_Manuscript.docx
+++ b/research/RIM3_ALAGA/RIM3_ALAGA_NSTF_Research_Manuscript.docx
@@ -44,7 +44,7 @@
       <w:r>
         <w:drawing>
           <wp:inline xmlns:a="http://schemas.openxmlformats.org/drawingml/2006/main" xmlns:pic="http://schemas.openxmlformats.org/drawingml/2006/picture">
-            <wp:extent cx="2468880" cy="2570670"/>
+            <wp:extent cx="2468880" cy="2517823"/>
             <wp:docPr id="1" name="Picture 1"/>
             <wp:cNvGraphicFramePr>
               <a:graphicFrameLocks noChangeAspect="1"/>
@@ -65,7 +65,7 @@
                   <pic:spPr>
                     <a:xfrm>
                       <a:off x="0" y="0"/>
-                      <a:ext cx="2468880" cy="2570670"/>
+                      <a:ext cx="2468880" cy="2517823"/>
                     </a:xfrm>
                     <a:prstGeom prst="rect"/>
                   </pic:spPr>
@@ -5005,7 +5005,7 @@
                 <w:b w:val="0"/>
                 <w:sz w:val="22"/>
               </w:rPr>
-              <w:t>IRF520 MOSFET module, wires, perfboard</w:t>
+              <w:t>D4184 MOSFET module, wires, perfboard</w:t>
             </w:r>
           </w:p>
         </w:tc>
@@ -5281,7 +5281,7 @@
       <w:r>
         <w:drawing>
           <wp:inline xmlns:a="http://schemas.openxmlformats.org/drawingml/2006/main" xmlns:pic="http://schemas.openxmlformats.org/drawingml/2006/picture">
-            <wp:extent cx="4480560" cy="4665291"/>
+            <wp:extent cx="4480560" cy="4569382"/>
             <wp:docPr id="3" name="Picture 3"/>
             <wp:cNvGraphicFramePr>
               <a:graphicFrameLocks noChangeAspect="1"/>
@@ -5302,7 +5302,7 @@
                   <pic:spPr>
                     <a:xfrm>
                       <a:off x="0" y="0"/>
-                      <a:ext cx="4480560" cy="4665291"/>
+                      <a:ext cx="4480560" cy="4569382"/>
                     </a:xfrm>
                     <a:prstGeom prst="rect"/>
                   </pic:spPr>
@@ -5399,7 +5399,7 @@
           <w:b w:val="0"/>
           <w:i w:val="0"/>
         </w:rPr>
-        <w:t>The MLX90614, MAX30102, and OLED share one I²C bus at 100 kHz. The HC-SR04 echo line passes through a 1 kΩ/2 kΩ divider to protect the 3.3 V ESP32. The fan is switched by an IRF520 MOSFET module with a flyback diode. Pin connections are in Appendix G.</w:t>
+        <w:t>The MLX90614, MAX30102, and OLED share one I²C bus at 100 kHz. The HC-SR04 echo line passes through a 1 kΩ/2 kΩ divider to protect the 3.3 V ESP32. The fan is switched by a D4184 logic-level MOSFET module with a flyback diode. Pin connections are in Appendix G.</w:t>
       </w:r>
     </w:p>
     <w:p>
@@ -13421,7 +13421,7 @@
                 <w:b w:val="0"/>
                 <w:sz w:val="20"/>
               </w:rPr>
-              <w:t>LM2596 regulator, IRF520 module, fuse</w:t>
+              <w:t>LM2596 regulator, D4184 module, fuse, switch</w:t>
             </w:r>
           </w:p>
         </w:tc>
@@ -16783,7 +16783,7 @@
                 <w:b w:val="0"/>
                 <w:sz w:val="20"/>
               </w:rPr>
-              <w:t>IRF520 module</w:t>
+              <w:t>D4184 MOSFET module</w:t>
             </w:r>
           </w:p>
         </w:tc>
@@ -16803,7 +16803,7 @@
                 <w:b w:val="0"/>
                 <w:sz w:val="20"/>
               </w:rPr>
-              <w:t>SIG</w:t>
+              <w:t>PWM</w:t>
             </w:r>
           </w:p>
         </w:tc>

</xml_diff>